<commit_message>
Update: Req. List member task update
</commit_message>
<xml_diff>
--- a/RequirementList.docx
+++ b/RequirementList.docx
@@ -439,11 +439,126 @@
           <w:p>
             <w:pPr>
               <w:rPr>
-                <w:color w:val="000000"/>
-                <w:sz w:val="20"/>
-                <w:szCs w:val="20"/>
-              </w:rPr>
-            </w:pPr>
+                <w:rFonts w:hint="eastAsia"/>
+                <w:color w:val="000000"/>
+                <w:sz w:val="20"/>
+                <w:szCs w:val="20"/>
+              </w:rPr>
+            </w:pPr>
+            <w:r>
+              <w:rPr>
+                <w:color w:val="000000"/>
+                <w:sz w:val="20"/>
+                <w:szCs w:val="20"/>
+              </w:rPr>
+              <w:t xml:space="preserve">4. </w:t>
+            </w:r>
+            <w:r>
+              <w:rPr>
+                <w:color w:val="000000"/>
+                <w:sz w:val="20"/>
+                <w:szCs w:val="20"/>
+              </w:rPr>
+              <w:t>로그아웃</w:t>
+            </w:r>
+            <w:r>
+              <w:rPr>
+                <w:rFonts w:hint="eastAsia"/>
+                <w:color w:val="000000"/>
+                <w:sz w:val="20"/>
+                <w:szCs w:val="20"/>
+              </w:rPr>
+              <w:t xml:space="preserve"> / </w:t>
+            </w:r>
+            <w:r>
+              <w:rPr>
+                <w:color w:val="000000"/>
+                <w:sz w:val="20"/>
+                <w:szCs w:val="20"/>
+              </w:rPr>
+              <w:t xml:space="preserve">9. </w:t>
+            </w:r>
+            <w:r>
+              <w:rPr>
+                <w:color w:val="000000"/>
+                <w:sz w:val="20"/>
+                <w:szCs w:val="20"/>
+              </w:rPr>
+              <w:t>설문</w:t>
+            </w:r>
+            <w:r>
+              <w:rPr>
+                <w:color w:val="000000"/>
+                <w:sz w:val="20"/>
+                <w:szCs w:val="20"/>
+              </w:rPr>
+              <w:t xml:space="preserve"> </w:t>
+            </w:r>
+            <w:r>
+              <w:rPr>
+                <w:color w:val="000000"/>
+                <w:sz w:val="20"/>
+                <w:szCs w:val="20"/>
+              </w:rPr>
+              <w:t>응답</w:t>
+            </w:r>
+            <w:r>
+              <w:rPr>
+                <w:rFonts w:hint="eastAsia"/>
+                <w:color w:val="000000"/>
+                <w:sz w:val="20"/>
+                <w:szCs w:val="20"/>
+              </w:rPr>
+              <w:t xml:space="preserve"> / </w:t>
+            </w:r>
+            <w:r>
+              <w:rPr>
+                <w:color w:val="000000"/>
+                <w:sz w:val="20"/>
+                <w:szCs w:val="20"/>
+              </w:rPr>
+              <w:t xml:space="preserve">11. </w:t>
+            </w:r>
+            <w:r>
+              <w:rPr>
+                <w:color w:val="000000"/>
+                <w:sz w:val="20"/>
+                <w:szCs w:val="20"/>
+              </w:rPr>
+              <w:t>설문</w:t>
+            </w:r>
+            <w:r>
+              <w:rPr>
+                <w:color w:val="000000"/>
+                <w:sz w:val="20"/>
+                <w:szCs w:val="20"/>
+              </w:rPr>
+              <w:t xml:space="preserve"> </w:t>
+            </w:r>
+            <w:r>
+              <w:rPr>
+                <w:color w:val="000000"/>
+                <w:sz w:val="20"/>
+                <w:szCs w:val="20"/>
+              </w:rPr>
+              <w:t>응답</w:t>
+            </w:r>
+            <w:r>
+              <w:rPr>
+                <w:color w:val="000000"/>
+                <w:sz w:val="20"/>
+                <w:szCs w:val="20"/>
+              </w:rPr>
+              <w:t xml:space="preserve"> </w:t>
+            </w:r>
+            <w:r>
+              <w:rPr>
+                <w:color w:val="000000"/>
+                <w:sz w:val="20"/>
+                <w:szCs w:val="20"/>
+              </w:rPr>
+              <w:t>수정</w:t>
+            </w:r>
           </w:p>
         </w:tc>
       </w:tr>
@@ -479,6 +594,7 @@
                 <w:szCs w:val="20"/>
               </w:rPr>
             </w:pPr>
+            <w:proofErr w:type="spellStart"/>
             <w:r>
               <w:rPr>
                 <w:rFonts w:eastAsia="Arial"/>
@@ -490,6 +606,7 @@
               </w:rPr>
               <w:t>신기연</w:t>
             </w:r>
+            <w:proofErr w:type="spellEnd"/>
           </w:p>
         </w:tc>
         <w:tc>
@@ -552,11 +669,190 @@
           <w:p>
             <w:pPr>
               <w:rPr>
-                <w:color w:val="000000"/>
-                <w:sz w:val="20"/>
-                <w:szCs w:val="20"/>
-              </w:rPr>
-            </w:pPr>
+                <w:rFonts w:hint="eastAsia"/>
+                <w:color w:val="000000"/>
+                <w:sz w:val="20"/>
+                <w:szCs w:val="20"/>
+              </w:rPr>
+            </w:pPr>
+            <w:r>
+              <w:rPr>
+                <w:color w:val="000000"/>
+                <w:sz w:val="20"/>
+                <w:szCs w:val="20"/>
+              </w:rPr>
+              <w:t xml:space="preserve">1. </w:t>
+            </w:r>
+            <w:r>
+              <w:rPr>
+                <w:color w:val="000000"/>
+                <w:sz w:val="20"/>
+                <w:szCs w:val="20"/>
+              </w:rPr>
+              <w:t>회원</w:t>
+            </w:r>
+            <w:r>
+              <w:rPr>
+                <w:color w:val="000000"/>
+                <w:sz w:val="20"/>
+                <w:szCs w:val="20"/>
+              </w:rPr>
+              <w:t xml:space="preserve"> </w:t>
+            </w:r>
+            <w:r>
+              <w:rPr>
+                <w:color w:val="000000"/>
+                <w:sz w:val="20"/>
+                <w:szCs w:val="20"/>
+              </w:rPr>
+              <w:t>가입</w:t>
+            </w:r>
+            <w:r>
+              <w:rPr>
+                <w:rFonts w:hint="eastAsia"/>
+                <w:color w:val="000000"/>
+                <w:sz w:val="20"/>
+                <w:szCs w:val="20"/>
+              </w:rPr>
+              <w:t xml:space="preserve"> / </w:t>
+            </w:r>
+            <w:r>
+              <w:rPr>
+                <w:color w:val="000000"/>
+                <w:sz w:val="20"/>
+                <w:szCs w:val="20"/>
+              </w:rPr>
+              <w:t xml:space="preserve">2. </w:t>
+            </w:r>
+            <w:r>
+              <w:rPr>
+                <w:color w:val="000000"/>
+                <w:sz w:val="20"/>
+                <w:szCs w:val="20"/>
+              </w:rPr>
+              <w:t>회원</w:t>
+            </w:r>
+            <w:r>
+              <w:rPr>
+                <w:color w:val="000000"/>
+                <w:sz w:val="20"/>
+                <w:szCs w:val="20"/>
+              </w:rPr>
+              <w:t xml:space="preserve"> </w:t>
+            </w:r>
+            <w:r>
+              <w:rPr>
+                <w:color w:val="000000"/>
+                <w:sz w:val="20"/>
+                <w:szCs w:val="20"/>
+              </w:rPr>
+              <w:t>탈퇴</w:t>
+            </w:r>
+            <w:r>
+              <w:rPr>
+                <w:rFonts w:hint="eastAsia"/>
+                <w:color w:val="000000"/>
+                <w:sz w:val="20"/>
+                <w:szCs w:val="20"/>
+              </w:rPr>
+              <w:t xml:space="preserve"> / </w:t>
+            </w:r>
+            <w:r>
+              <w:rPr>
+                <w:color w:val="000000"/>
+                <w:sz w:val="20"/>
+                <w:szCs w:val="20"/>
+              </w:rPr>
+              <w:t xml:space="preserve">10. </w:t>
+            </w:r>
+            <w:r>
+              <w:rPr>
+                <w:color w:val="000000"/>
+                <w:sz w:val="20"/>
+                <w:szCs w:val="20"/>
+              </w:rPr>
+              <w:t>응답한</w:t>
+            </w:r>
+            <w:r>
+              <w:rPr>
+                <w:color w:val="000000"/>
+                <w:sz w:val="20"/>
+                <w:szCs w:val="20"/>
+              </w:rPr>
+              <w:t xml:space="preserve"> </w:t>
+            </w:r>
+            <w:r>
+              <w:rPr>
+                <w:color w:val="000000"/>
+                <w:sz w:val="20"/>
+                <w:szCs w:val="20"/>
+              </w:rPr>
+              <w:t>설문</w:t>
+            </w:r>
+            <w:r>
+              <w:rPr>
+                <w:color w:val="000000"/>
+                <w:sz w:val="20"/>
+                <w:szCs w:val="20"/>
+              </w:rPr>
+              <w:t xml:space="preserve"> </w:t>
+            </w:r>
+            <w:r>
+              <w:rPr>
+                <w:color w:val="000000"/>
+                <w:sz w:val="20"/>
+                <w:szCs w:val="20"/>
+              </w:rPr>
+              <w:t>조회</w:t>
+            </w:r>
+            <w:r>
+              <w:rPr>
+                <w:color w:val="000000"/>
+                <w:sz w:val="20"/>
+                <w:szCs w:val="20"/>
+              </w:rPr>
+              <w:t xml:space="preserve">, </w:t>
+            </w:r>
+            <w:r>
+              <w:rPr>
+                <w:color w:val="000000"/>
+                <w:sz w:val="20"/>
+                <w:szCs w:val="20"/>
+              </w:rPr>
+              <w:t>응답한</w:t>
+            </w:r>
+            <w:r>
+              <w:rPr>
+                <w:color w:val="000000"/>
+                <w:sz w:val="20"/>
+                <w:szCs w:val="20"/>
+              </w:rPr>
+              <w:t xml:space="preserve"> </w:t>
+            </w:r>
+            <w:r>
+              <w:rPr>
+                <w:color w:val="000000"/>
+                <w:sz w:val="20"/>
+                <w:szCs w:val="20"/>
+              </w:rPr>
+              <w:t>설문</w:t>
+            </w:r>
+            <w:r>
+              <w:rPr>
+                <w:color w:val="000000"/>
+                <w:sz w:val="20"/>
+                <w:szCs w:val="20"/>
+              </w:rPr>
+              <w:t xml:space="preserve"> </w:t>
+            </w:r>
+            <w:r>
+              <w:rPr>
+                <w:color w:val="000000"/>
+                <w:sz w:val="20"/>
+                <w:szCs w:val="20"/>
+              </w:rPr>
+              <w:t>취소</w:t>
+            </w:r>
           </w:p>
         </w:tc>
       </w:tr>
@@ -665,11 +961,142 @@
           <w:p>
             <w:pPr>
               <w:rPr>
-                <w:color w:val="000000"/>
-                <w:sz w:val="20"/>
-                <w:szCs w:val="20"/>
-              </w:rPr>
-            </w:pPr>
+                <w:rFonts w:hint="eastAsia"/>
+                <w:color w:val="000000"/>
+                <w:sz w:val="20"/>
+                <w:szCs w:val="20"/>
+              </w:rPr>
+            </w:pPr>
+            <w:r>
+              <w:rPr>
+                <w:color w:val="000000"/>
+                <w:sz w:val="20"/>
+                <w:szCs w:val="20"/>
+              </w:rPr>
+              <w:t xml:space="preserve">3. </w:t>
+            </w:r>
+            <w:r>
+              <w:rPr>
+                <w:color w:val="000000"/>
+                <w:sz w:val="20"/>
+                <w:szCs w:val="20"/>
+              </w:rPr>
+              <w:t>로그인</w:t>
+            </w:r>
+            <w:r>
+              <w:rPr>
+                <w:rFonts w:hint="eastAsia"/>
+                <w:color w:val="000000"/>
+                <w:sz w:val="20"/>
+                <w:szCs w:val="20"/>
+              </w:rPr>
+              <w:t xml:space="preserve"> / </w:t>
+            </w:r>
+            <w:r>
+              <w:rPr>
+                <w:color w:val="000000"/>
+                <w:sz w:val="20"/>
+                <w:szCs w:val="20"/>
+              </w:rPr>
+              <w:t xml:space="preserve">5. </w:t>
+            </w:r>
+            <w:r>
+              <w:rPr>
+                <w:color w:val="000000"/>
+                <w:sz w:val="20"/>
+                <w:szCs w:val="20"/>
+              </w:rPr>
+              <w:t>설문</w:t>
+            </w:r>
+            <w:r>
+              <w:rPr>
+                <w:color w:val="000000"/>
+                <w:sz w:val="20"/>
+                <w:szCs w:val="20"/>
+              </w:rPr>
+              <w:t xml:space="preserve"> </w:t>
+            </w:r>
+            <w:r>
+              <w:rPr>
+                <w:color w:val="000000"/>
+                <w:sz w:val="20"/>
+                <w:szCs w:val="20"/>
+              </w:rPr>
+              <w:t>등록</w:t>
+            </w:r>
+            <w:r>
+              <w:rPr>
+                <w:rFonts w:hint="eastAsia"/>
+                <w:color w:val="000000"/>
+                <w:sz w:val="20"/>
+                <w:szCs w:val="20"/>
+              </w:rPr>
+              <w:t xml:space="preserve"> / </w:t>
+            </w:r>
+            <w:r>
+              <w:rPr>
+                <w:color w:val="000000"/>
+                <w:sz w:val="20"/>
+                <w:szCs w:val="20"/>
+              </w:rPr>
+              <w:t xml:space="preserve">12. </w:t>
+            </w:r>
+            <w:r>
+              <w:rPr>
+                <w:color w:val="000000"/>
+                <w:sz w:val="20"/>
+                <w:szCs w:val="20"/>
+              </w:rPr>
+              <w:t>응답</w:t>
+            </w:r>
+            <w:r>
+              <w:rPr>
+                <w:color w:val="000000"/>
+                <w:sz w:val="20"/>
+                <w:szCs w:val="20"/>
+              </w:rPr>
+              <w:t xml:space="preserve"> </w:t>
+            </w:r>
+            <w:r>
+              <w:rPr>
+                <w:color w:val="000000"/>
+                <w:sz w:val="20"/>
+                <w:szCs w:val="20"/>
+              </w:rPr>
+              <w:t>통계</w:t>
+            </w:r>
+            <w:r>
+              <w:rPr>
+                <w:color w:val="000000"/>
+                <w:sz w:val="20"/>
+                <w:szCs w:val="20"/>
+              </w:rPr>
+              <w:t xml:space="preserve"> </w:t>
+            </w:r>
+            <w:r>
+              <w:rPr>
+                <w:color w:val="000000"/>
+                <w:sz w:val="20"/>
+                <w:szCs w:val="20"/>
+              </w:rPr>
+              <w:t>정보</w:t>
+            </w:r>
+            <w:r>
+              <w:rPr>
+                <w:color w:val="000000"/>
+                <w:sz w:val="20"/>
+                <w:szCs w:val="20"/>
+              </w:rPr>
+              <w:t xml:space="preserve"> </w:t>
+            </w:r>
+            <w:r>
+              <w:rPr>
+                <w:color w:val="000000"/>
+                <w:sz w:val="20"/>
+                <w:szCs w:val="20"/>
+              </w:rPr>
+              <w:t>조회</w:t>
+            </w:r>
           </w:p>
         </w:tc>
       </w:tr>
@@ -705,6 +1132,7 @@
                 <w:szCs w:val="20"/>
               </w:rPr>
             </w:pPr>
+            <w:proofErr w:type="spellStart"/>
             <w:r>
               <w:rPr>
                 <w:rFonts w:eastAsia="Arial"/>
@@ -716,6 +1144,7 @@
               </w:rPr>
               <w:t>원지희</w:t>
             </w:r>
+            <w:proofErr w:type="spellEnd"/>
           </w:p>
         </w:tc>
         <w:tc>
@@ -778,11 +1207,174 @@
           <w:p>
             <w:pPr>
               <w:rPr>
-                <w:color w:val="000000"/>
-                <w:sz w:val="20"/>
-                <w:szCs w:val="20"/>
-              </w:rPr>
-            </w:pPr>
+                <w:rFonts w:hint="eastAsia"/>
+                <w:color w:val="000000"/>
+                <w:sz w:val="20"/>
+                <w:szCs w:val="20"/>
+              </w:rPr>
+            </w:pPr>
+            <w:r>
+              <w:rPr>
+                <w:color w:val="000000"/>
+                <w:sz w:val="20"/>
+                <w:szCs w:val="20"/>
+              </w:rPr>
+              <w:t xml:space="preserve">6. </w:t>
+            </w:r>
+            <w:r>
+              <w:rPr>
+                <w:color w:val="000000"/>
+                <w:sz w:val="20"/>
+                <w:szCs w:val="20"/>
+              </w:rPr>
+              <w:t>설문</w:t>
+            </w:r>
+            <w:r>
+              <w:rPr>
+                <w:color w:val="000000"/>
+                <w:sz w:val="20"/>
+                <w:szCs w:val="20"/>
+              </w:rPr>
+              <w:t xml:space="preserve"> </w:t>
+            </w:r>
+            <w:r>
+              <w:rPr>
+                <w:color w:val="000000"/>
+                <w:sz w:val="20"/>
+                <w:szCs w:val="20"/>
+              </w:rPr>
+              <w:t>조회</w:t>
+            </w:r>
+            <w:r>
+              <w:rPr>
+                <w:color w:val="000000"/>
+                <w:sz w:val="20"/>
+                <w:szCs w:val="20"/>
+              </w:rPr>
+              <w:t xml:space="preserve">, </w:t>
+            </w:r>
+            <w:r>
+              <w:rPr>
+                <w:color w:val="000000"/>
+                <w:sz w:val="20"/>
+                <w:szCs w:val="20"/>
+              </w:rPr>
+              <w:t>설문</w:t>
+            </w:r>
+            <w:r>
+              <w:rPr>
+                <w:color w:val="000000"/>
+                <w:sz w:val="20"/>
+                <w:szCs w:val="20"/>
+              </w:rPr>
+              <w:t xml:space="preserve"> </w:t>
+            </w:r>
+            <w:r>
+              <w:rPr>
+                <w:color w:val="000000"/>
+                <w:sz w:val="20"/>
+                <w:szCs w:val="20"/>
+              </w:rPr>
+              <w:t>삭제</w:t>
+            </w:r>
+            <w:r>
+              <w:rPr>
+                <w:rFonts w:hint="eastAsia"/>
+                <w:color w:val="000000"/>
+                <w:sz w:val="20"/>
+                <w:szCs w:val="20"/>
+              </w:rPr>
+              <w:t xml:space="preserve"> / </w:t>
+            </w:r>
+            <w:r>
+              <w:rPr>
+                <w:color w:val="000000"/>
+                <w:sz w:val="20"/>
+                <w:szCs w:val="20"/>
+              </w:rPr>
+              <w:t xml:space="preserve">7. </w:t>
+            </w:r>
+            <w:r>
+              <w:rPr>
+                <w:color w:val="000000"/>
+                <w:sz w:val="20"/>
+                <w:szCs w:val="20"/>
+              </w:rPr>
+              <w:t>설문</w:t>
+            </w:r>
+            <w:r>
+              <w:rPr>
+                <w:color w:val="000000"/>
+                <w:sz w:val="20"/>
+                <w:szCs w:val="20"/>
+              </w:rPr>
+              <w:t xml:space="preserve"> </w:t>
+            </w:r>
+            <w:r>
+              <w:rPr>
+                <w:color w:val="000000"/>
+                <w:sz w:val="20"/>
+                <w:szCs w:val="20"/>
+              </w:rPr>
+              <w:t>검색</w:t>
+            </w:r>
+            <w:r>
+              <w:rPr>
+                <w:rFonts w:hint="eastAsia"/>
+                <w:color w:val="000000"/>
+                <w:sz w:val="20"/>
+                <w:szCs w:val="20"/>
+              </w:rPr>
+              <w:t xml:space="preserve"> / </w:t>
+            </w:r>
+            <w:r>
+              <w:rPr>
+                <w:color w:val="000000"/>
+                <w:sz w:val="20"/>
+                <w:szCs w:val="20"/>
+              </w:rPr>
+              <w:t xml:space="preserve">8. </w:t>
+            </w:r>
+            <w:r>
+              <w:rPr>
+                <w:color w:val="000000"/>
+                <w:sz w:val="20"/>
+                <w:szCs w:val="20"/>
+              </w:rPr>
+              <w:t>설문</w:t>
+            </w:r>
+            <w:r>
+              <w:rPr>
+                <w:color w:val="000000"/>
+                <w:sz w:val="20"/>
+                <w:szCs w:val="20"/>
+              </w:rPr>
+              <w:t xml:space="preserve"> </w:t>
+            </w:r>
+            <w:r>
+              <w:rPr>
+                <w:color w:val="000000"/>
+                <w:sz w:val="20"/>
+                <w:szCs w:val="20"/>
+              </w:rPr>
+              <w:t>상세정보</w:t>
+            </w:r>
+            <w:r>
+              <w:rPr>
+                <w:color w:val="000000"/>
+                <w:sz w:val="20"/>
+                <w:szCs w:val="20"/>
+              </w:rPr>
+              <w:t xml:space="preserve"> </w:t>
+            </w:r>
+            <w:r>
+              <w:rPr>
+                <w:color w:val="000000"/>
+                <w:sz w:val="20"/>
+                <w:szCs w:val="20"/>
+              </w:rPr>
+              <w:t>조회</w:t>
+            </w:r>
           </w:p>
         </w:tc>
       </w:tr>
@@ -2066,7 +2658,7 @@
           <w:p>
             <w:pPr>
               <w:rPr>
-                <w:rFonts w:ascii="함초롬바탕" w:eastAsia="함초롬바탕" w:hAnsi="함초롬바탕" w:cs="함초롬바탕" w:hint="eastAsia"/>
+                <w:rFonts w:ascii="함초롬바탕" w:eastAsia="함초롬바탕" w:hAnsi="함초롬바탕" w:cs="함초롬바탕"/>
                 <w:b/>
                 <w:bCs/>
                 <w:color w:val="000000"/>
@@ -2898,16 +3490,29 @@
                 <w:szCs w:val="18"/>
               </w:rPr>
             </w:pPr>
-            <w:r>
-              <w:rPr>
-                <w:rFonts w:ascii="함초롬바탕" w:eastAsia="함초롬바탕" w:hAnsi="함초롬바탕" w:cs="함초롬바탕" w:hint="eastAsia"/>
-                <w:b/>
-                <w:bCs/>
-                <w:color w:val="000000"/>
-                <w:sz w:val="18"/>
-                <w:szCs w:val="18"/>
-              </w:rPr>
-              <w:t xml:space="preserve">회원용 </w:t>
+            <w:proofErr w:type="spellStart"/>
+            <w:r>
+              <w:rPr>
+                <w:rFonts w:ascii="함초롬바탕" w:eastAsia="함초롬바탕" w:hAnsi="함초롬바탕" w:cs="함초롬바탕" w:hint="eastAsia"/>
+                <w:b/>
+                <w:bCs/>
+                <w:color w:val="000000"/>
+                <w:sz w:val="18"/>
+                <w:szCs w:val="18"/>
+              </w:rPr>
+              <w:t>회원용</w:t>
+            </w:r>
+            <w:proofErr w:type="spellEnd"/>
+            <w:r>
+              <w:rPr>
+                <w:rFonts w:ascii="함초롬바탕" w:eastAsia="함초롬바탕" w:hAnsi="함초롬바탕" w:cs="함초롬바탕" w:hint="eastAsia"/>
+                <w:b/>
+                <w:bCs/>
+                <w:color w:val="000000"/>
+                <w:sz w:val="18"/>
+                <w:szCs w:val="18"/>
+              </w:rPr>
+              <w:t xml:space="preserve"> </w:t>
             </w:r>
             <w:r>
               <w:rPr>
@@ -4510,7 +5115,6 @@
   <w:style w:type="character" w:default="1" w:styleId="a0">
     <w:name w:val="Default Paragraph Font"/>
     <w:uiPriority w:val="1"/>
-    <w:semiHidden/>
     <w:unhideWhenUsed/>
   </w:style>
   <w:style w:type="table" w:default="1" w:styleId="a1">

</xml_diff>